<commit_message>
Agregado link al video
</commit_message>
<xml_diff>
--- a/PROYECTO FINAL DE MÁSTER.docx
+++ b/PROYECTO FINAL DE MÁSTER.docx
@@ -17537,6 +17537,69 @@
         <w:t>Además de cumplir una finalidad técnica y académica, la aplicación parte de un problema real y busca aportar una solución práctica para facilitar la organización y consulta de la información económica familiar.</w:t>
       </w:r>
     </w:p>
+    <w:p>
+      <w:pPr>
+        <w:spacing w:after="0" w:line="240" w:lineRule="auto"/>
+        <w:rPr>
+          <w:rFonts w:ascii="Arial" w:hAnsi="Arial" w:cs="Arial"/>
+          <w:sz w:val="28"/>
+        </w:rPr>
+      </w:pPr>
+    </w:p>
+    <w:p>
+      <w:pPr>
+        <w:spacing w:after="0" w:line="240" w:lineRule="auto"/>
+        <w:rPr>
+          <w:rFonts w:ascii="Arial" w:hAnsi="Arial" w:cs="Arial"/>
+          <w:sz w:val="28"/>
+        </w:rPr>
+      </w:pPr>
+    </w:p>
+    <w:p>
+      <w:pPr>
+        <w:spacing w:after="0" w:line="240" w:lineRule="auto"/>
+        <w:rPr>
+          <w:rFonts w:ascii="Arial" w:hAnsi="Arial" w:cs="Arial"/>
+          <w:sz w:val="28"/>
+        </w:rPr>
+      </w:pPr>
+    </w:p>
+    <w:p>
+      <w:pPr>
+        <w:spacing w:after="0" w:line="240" w:lineRule="auto"/>
+        <w:rPr>
+          <w:rFonts w:ascii="Arial" w:hAnsi="Arial" w:cs="Arial"/>
+          <w:sz w:val="28"/>
+        </w:rPr>
+      </w:pPr>
+    </w:p>
+    <w:p>
+      <w:pPr>
+        <w:spacing w:after="0" w:line="240" w:lineRule="auto"/>
+        <w:rPr>
+          <w:rFonts w:ascii="Arial" w:hAnsi="Arial" w:cs="Arial"/>
+          <w:b/>
+          <w:i/>
+          <w:sz w:val="36"/>
+        </w:rPr>
+      </w:pPr>
+      <w:r>
+        <w:rPr>
+          <w:rFonts w:ascii="Arial" w:hAnsi="Arial" w:cs="Arial"/>
+          <w:b/>
+          <w:i/>
+          <w:sz w:val="36"/>
+        </w:rPr>
+        <w:t>Link Al Video:</w:t>
+      </w:r>
+      <w:r>
+        <w:rPr>
+          <w:rFonts w:ascii="Arial" w:hAnsi="Arial" w:cs="Arial"/>
+          <w:sz w:val="36"/>
+        </w:rPr>
+        <w:t>https://www.youtube.com/watch?v=a6V0oSy5cMs</w:t>
+      </w:r>
+    </w:p>
     <w:sectPr>
       <w:pgSz w:w="11906" w:h="16838"/>
       <w:pgMar w:top="720" w:right="720" w:bottom="720" w:left="720" w:header="708" w:footer="708" w:gutter="0"/>

</xml_diff>